<commit_message>
added quartiles and deciles tables
</commit_message>
<xml_diff>
--- a/docs/2024_403_EliseevEV.docx
+++ b/docs/2024_403_EliseevEV.docx
@@ -1029,7 +1029,6 @@
       </w:r>
       <w:r>
         <w:rPr>
-          <w:noProof/>
           <w:sz w:val="28"/>
           <w:szCs w:val="28"/>
         </w:rPr>
@@ -1405,7 +1404,6 @@
         <w:rPr>
           <w:rFonts w:cs="Arial"/>
           <w:bCs/>
-          <w:noProof/>
           <w:sz w:val="28"/>
           <w:szCs w:val="28"/>
         </w:rPr>
@@ -2139,7 +2137,6 @@
         <w:rPr>
           <w:rFonts w:cs="Arial"/>
           <w:bCs/>
-          <w:noProof/>
           <w:sz w:val="28"/>
           <w:szCs w:val="28"/>
         </w:rPr>
@@ -2363,7 +2360,6 @@
             <w:pStyle w:val="TOC1"/>
             <w:rPr>
               <w:rFonts w:asciiTheme="minorHAnsi" w:eastAsiaTheme="minorEastAsia" w:hAnsiTheme="minorHAnsi" w:cstheme="minorBidi"/>
-              <w:noProof/>
               <w:kern w:val="2"/>
               <w:sz w:val="28"/>
               <w:szCs w:val="28"/>
@@ -2395,7 +2391,6 @@
             <w:r>
               <w:rPr>
                 <w:rStyle w:val="Hyperlink"/>
-                <w:noProof/>
                 <w:sz w:val="28"/>
                 <w:szCs w:val="28"/>
               </w:rPr>
@@ -2403,7 +2398,6 @@
             </w:r>
             <w:r>
               <w:rPr>
-                <w:noProof/>
                 <w:webHidden/>
                 <w:sz w:val="28"/>
                 <w:szCs w:val="28"/>
@@ -2412,7 +2406,6 @@
             </w:r>
             <w:r>
               <w:rPr>
-                <w:noProof/>
                 <w:webHidden/>
                 <w:sz w:val="28"/>
                 <w:szCs w:val="28"/>
@@ -2421,7 +2414,6 @@
             </w:r>
             <w:r>
               <w:rPr>
-                <w:noProof/>
                 <w:webHidden/>
                 <w:sz w:val="28"/>
                 <w:szCs w:val="28"/>
@@ -2430,7 +2422,6 @@
             </w:r>
             <w:r>
               <w:rPr>
-                <w:noProof/>
                 <w:webHidden/>
                 <w:sz w:val="28"/>
                 <w:szCs w:val="28"/>
@@ -2438,7 +2429,6 @@
             </w:r>
             <w:r>
               <w:rPr>
-                <w:noProof/>
                 <w:webHidden/>
                 <w:sz w:val="28"/>
                 <w:szCs w:val="28"/>
@@ -2447,7 +2437,6 @@
             </w:r>
             <w:r>
               <w:rPr>
-                <w:noProof/>
                 <w:webHidden/>
                 <w:sz w:val="28"/>
                 <w:szCs w:val="28"/>
@@ -2456,7 +2445,6 @@
             </w:r>
             <w:r>
               <w:rPr>
-                <w:noProof/>
                 <w:webHidden/>
                 <w:sz w:val="28"/>
                 <w:szCs w:val="28"/>
@@ -2470,7 +2458,6 @@
             <w:pStyle w:val="TOC1"/>
             <w:rPr>
               <w:rFonts w:asciiTheme="minorHAnsi" w:eastAsiaTheme="minorEastAsia" w:hAnsiTheme="minorHAnsi" w:cstheme="minorBidi"/>
-              <w:noProof/>
               <w:kern w:val="2"/>
               <w:sz w:val="28"/>
               <w:szCs w:val="28"/>
@@ -2481,7 +2468,6 @@
             <w:r>
               <w:rPr>
                 <w:rStyle w:val="Hyperlink"/>
-                <w:noProof/>
                 <w:sz w:val="28"/>
                 <w:szCs w:val="28"/>
               </w:rPr>
@@ -2490,7 +2476,6 @@
             <w:r>
               <w:rPr>
                 <w:rFonts w:asciiTheme="minorHAnsi" w:eastAsiaTheme="minorEastAsia" w:hAnsiTheme="minorHAnsi" w:cstheme="minorBidi"/>
-                <w:noProof/>
                 <w:kern w:val="2"/>
                 <w:sz w:val="28"/>
                 <w:szCs w:val="28"/>
@@ -2501,7 +2486,6 @@
             <w:r>
               <w:rPr>
                 <w:rStyle w:val="Hyperlink"/>
-                <w:noProof/>
                 <w:sz w:val="28"/>
                 <w:szCs w:val="28"/>
               </w:rPr>
@@ -2509,7 +2493,6 @@
             </w:r>
             <w:r>
               <w:rPr>
-                <w:noProof/>
                 <w:webHidden/>
                 <w:sz w:val="28"/>
                 <w:szCs w:val="28"/>
@@ -2518,7 +2501,6 @@
             </w:r>
             <w:r>
               <w:rPr>
-                <w:noProof/>
                 <w:webHidden/>
                 <w:sz w:val="28"/>
                 <w:szCs w:val="28"/>
@@ -2527,7 +2509,6 @@
             </w:r>
             <w:r>
               <w:rPr>
-                <w:noProof/>
                 <w:webHidden/>
                 <w:sz w:val="28"/>
                 <w:szCs w:val="28"/>
@@ -2536,7 +2517,6 @@
             </w:r>
             <w:r>
               <w:rPr>
-                <w:noProof/>
                 <w:webHidden/>
                 <w:sz w:val="28"/>
                 <w:szCs w:val="28"/>
@@ -2544,7 +2524,6 @@
             </w:r>
             <w:r>
               <w:rPr>
-                <w:noProof/>
                 <w:webHidden/>
                 <w:sz w:val="28"/>
                 <w:szCs w:val="28"/>
@@ -2553,7 +2532,6 @@
             </w:r>
             <w:r>
               <w:rPr>
-                <w:noProof/>
                 <w:webHidden/>
                 <w:sz w:val="28"/>
                 <w:szCs w:val="28"/>
@@ -2562,7 +2540,6 @@
             </w:r>
             <w:r>
               <w:rPr>
-                <w:noProof/>
                 <w:webHidden/>
                 <w:sz w:val="28"/>
                 <w:szCs w:val="28"/>
@@ -2576,7 +2553,6 @@
             <w:pStyle w:val="TOC2"/>
             <w:rPr>
               <w:rFonts w:asciiTheme="minorHAnsi" w:eastAsiaTheme="minorEastAsia" w:hAnsiTheme="minorHAnsi" w:cstheme="minorBidi"/>
-              <w:noProof/>
               <w:kern w:val="2"/>
               <w:sz w:val="28"/>
               <w:szCs w:val="28"/>
@@ -2587,7 +2563,6 @@
             <w:r>
               <w:rPr>
                 <w:rStyle w:val="Hyperlink"/>
-                <w:noProof/>
                 <w:sz w:val="28"/>
                 <w:szCs w:val="28"/>
               </w:rPr>
@@ -2596,7 +2571,6 @@
             <w:r>
               <w:rPr>
                 <w:rFonts w:asciiTheme="minorHAnsi" w:eastAsiaTheme="minorEastAsia" w:hAnsiTheme="minorHAnsi" w:cstheme="minorBidi"/>
-                <w:noProof/>
                 <w:kern w:val="2"/>
                 <w:sz w:val="28"/>
                 <w:szCs w:val="28"/>
@@ -2607,7 +2581,6 @@
             <w:r>
               <w:rPr>
                 <w:rStyle w:val="Hyperlink"/>
-                <w:noProof/>
                 <w:sz w:val="28"/>
                 <w:szCs w:val="28"/>
               </w:rPr>
@@ -2615,7 +2588,6 @@
             </w:r>
             <w:r>
               <w:rPr>
-                <w:noProof/>
                 <w:webHidden/>
                 <w:sz w:val="28"/>
                 <w:szCs w:val="28"/>
@@ -2624,7 +2596,6 @@
             </w:r>
             <w:r>
               <w:rPr>
-                <w:noProof/>
                 <w:webHidden/>
                 <w:sz w:val="28"/>
                 <w:szCs w:val="28"/>
@@ -2633,7 +2604,6 @@
             </w:r>
             <w:r>
               <w:rPr>
-                <w:noProof/>
                 <w:webHidden/>
                 <w:sz w:val="28"/>
                 <w:szCs w:val="28"/>
@@ -2642,7 +2612,6 @@
             </w:r>
             <w:r>
               <w:rPr>
-                <w:noProof/>
                 <w:webHidden/>
                 <w:sz w:val="28"/>
                 <w:szCs w:val="28"/>
@@ -2650,7 +2619,6 @@
             </w:r>
             <w:r>
               <w:rPr>
-                <w:noProof/>
                 <w:webHidden/>
                 <w:sz w:val="28"/>
                 <w:szCs w:val="28"/>
@@ -2659,7 +2627,6 @@
             </w:r>
             <w:r>
               <w:rPr>
-                <w:noProof/>
                 <w:webHidden/>
                 <w:sz w:val="28"/>
                 <w:szCs w:val="28"/>
@@ -2668,7 +2635,6 @@
             </w:r>
             <w:r>
               <w:rPr>
-                <w:noProof/>
                 <w:webHidden/>
                 <w:sz w:val="28"/>
                 <w:szCs w:val="28"/>
@@ -2682,7 +2648,6 @@
             <w:pStyle w:val="TOC2"/>
             <w:rPr>
               <w:rFonts w:asciiTheme="minorHAnsi" w:eastAsiaTheme="minorEastAsia" w:hAnsiTheme="minorHAnsi" w:cstheme="minorBidi"/>
-              <w:noProof/>
               <w:kern w:val="2"/>
               <w:sz w:val="28"/>
               <w:szCs w:val="28"/>
@@ -2693,7 +2658,6 @@
             <w:r>
               <w:rPr>
                 <w:rStyle w:val="Hyperlink"/>
-                <w:noProof/>
                 <w:sz w:val="28"/>
                 <w:szCs w:val="28"/>
               </w:rPr>
@@ -2702,7 +2666,6 @@
             <w:r>
               <w:rPr>
                 <w:rFonts w:asciiTheme="minorHAnsi" w:eastAsiaTheme="minorEastAsia" w:hAnsiTheme="minorHAnsi" w:cstheme="minorBidi"/>
-                <w:noProof/>
                 <w:kern w:val="2"/>
                 <w:sz w:val="28"/>
                 <w:szCs w:val="28"/>
@@ -2713,7 +2676,6 @@
             <w:r>
               <w:rPr>
                 <w:rStyle w:val="Hyperlink"/>
-                <w:noProof/>
                 <w:sz w:val="28"/>
                 <w:szCs w:val="28"/>
               </w:rPr>
@@ -2721,7 +2683,6 @@
             </w:r>
             <w:r>
               <w:rPr>
-                <w:noProof/>
                 <w:webHidden/>
                 <w:sz w:val="28"/>
                 <w:szCs w:val="28"/>
@@ -2730,7 +2691,6 @@
             </w:r>
             <w:r>
               <w:rPr>
-                <w:noProof/>
                 <w:webHidden/>
                 <w:sz w:val="28"/>
                 <w:szCs w:val="28"/>
@@ -2739,7 +2699,6 @@
             </w:r>
             <w:r>
               <w:rPr>
-                <w:noProof/>
                 <w:webHidden/>
                 <w:sz w:val="28"/>
                 <w:szCs w:val="28"/>
@@ -2748,7 +2707,6 @@
             </w:r>
             <w:r>
               <w:rPr>
-                <w:noProof/>
                 <w:webHidden/>
                 <w:sz w:val="28"/>
                 <w:szCs w:val="28"/>
@@ -2756,7 +2714,6 @@
             </w:r>
             <w:r>
               <w:rPr>
-                <w:noProof/>
                 <w:webHidden/>
                 <w:sz w:val="28"/>
                 <w:szCs w:val="28"/>
@@ -2765,7 +2722,6 @@
             </w:r>
             <w:r>
               <w:rPr>
-                <w:noProof/>
                 <w:webHidden/>
                 <w:sz w:val="28"/>
                 <w:szCs w:val="28"/>
@@ -2774,7 +2730,6 @@
             </w:r>
             <w:r>
               <w:rPr>
-                <w:noProof/>
                 <w:webHidden/>
                 <w:sz w:val="28"/>
                 <w:szCs w:val="28"/>
@@ -2788,7 +2743,6 @@
             <w:pStyle w:val="TOC1"/>
             <w:rPr>
               <w:rFonts w:asciiTheme="minorHAnsi" w:eastAsiaTheme="minorEastAsia" w:hAnsiTheme="minorHAnsi" w:cstheme="minorBidi"/>
-              <w:noProof/>
               <w:kern w:val="2"/>
               <w:sz w:val="28"/>
               <w:szCs w:val="28"/>
@@ -2799,7 +2753,6 @@
             <w:r>
               <w:rPr>
                 <w:rStyle w:val="Hyperlink"/>
-                <w:noProof/>
                 <w:sz w:val="28"/>
                 <w:szCs w:val="28"/>
               </w:rPr>
@@ -2808,7 +2761,6 @@
             <w:r>
               <w:rPr>
                 <w:rFonts w:asciiTheme="minorHAnsi" w:eastAsiaTheme="minorEastAsia" w:hAnsiTheme="minorHAnsi" w:cstheme="minorBidi"/>
-                <w:noProof/>
                 <w:kern w:val="2"/>
                 <w:sz w:val="28"/>
                 <w:szCs w:val="28"/>
@@ -2819,7 +2771,6 @@
             <w:r>
               <w:rPr>
                 <w:rStyle w:val="Hyperlink"/>
-                <w:noProof/>
                 <w:sz w:val="28"/>
                 <w:szCs w:val="28"/>
               </w:rPr>
@@ -2827,7 +2778,6 @@
             </w:r>
             <w:r>
               <w:rPr>
-                <w:noProof/>
                 <w:webHidden/>
                 <w:sz w:val="28"/>
                 <w:szCs w:val="28"/>
@@ -2836,7 +2786,6 @@
             </w:r>
             <w:r>
               <w:rPr>
-                <w:noProof/>
                 <w:webHidden/>
                 <w:sz w:val="28"/>
                 <w:szCs w:val="28"/>
@@ -2845,7 +2794,6 @@
             </w:r>
             <w:r>
               <w:rPr>
-                <w:noProof/>
                 <w:webHidden/>
                 <w:sz w:val="28"/>
                 <w:szCs w:val="28"/>
@@ -2854,7 +2802,6 @@
             </w:r>
             <w:r>
               <w:rPr>
-                <w:noProof/>
                 <w:webHidden/>
                 <w:sz w:val="28"/>
                 <w:szCs w:val="28"/>
@@ -2862,7 +2809,6 @@
             </w:r>
             <w:r>
               <w:rPr>
-                <w:noProof/>
                 <w:webHidden/>
                 <w:sz w:val="28"/>
                 <w:szCs w:val="28"/>
@@ -2871,7 +2817,6 @@
             </w:r>
             <w:r>
               <w:rPr>
-                <w:noProof/>
                 <w:webHidden/>
                 <w:sz w:val="28"/>
                 <w:szCs w:val="28"/>
@@ -2880,7 +2825,6 @@
             </w:r>
             <w:r>
               <w:rPr>
-                <w:noProof/>
                 <w:webHidden/>
                 <w:sz w:val="28"/>
                 <w:szCs w:val="28"/>
@@ -2894,7 +2838,6 @@
             <w:pStyle w:val="TOC2"/>
             <w:rPr>
               <w:rFonts w:asciiTheme="minorHAnsi" w:eastAsiaTheme="minorEastAsia" w:hAnsiTheme="minorHAnsi" w:cstheme="minorBidi"/>
-              <w:noProof/>
               <w:kern w:val="2"/>
               <w:sz w:val="28"/>
               <w:szCs w:val="28"/>
@@ -2905,7 +2848,6 @@
             <w:r>
               <w:rPr>
                 <w:rStyle w:val="Hyperlink"/>
-                <w:noProof/>
                 <w:sz w:val="28"/>
                 <w:szCs w:val="28"/>
               </w:rPr>
@@ -2914,7 +2856,6 @@
             <w:r>
               <w:rPr>
                 <w:rFonts w:asciiTheme="minorHAnsi" w:eastAsiaTheme="minorEastAsia" w:hAnsiTheme="minorHAnsi" w:cstheme="minorBidi"/>
-                <w:noProof/>
                 <w:kern w:val="2"/>
                 <w:sz w:val="28"/>
                 <w:szCs w:val="28"/>
@@ -2925,7 +2866,6 @@
             <w:r>
               <w:rPr>
                 <w:rStyle w:val="Hyperlink"/>
-                <w:noProof/>
                 <w:sz w:val="28"/>
                 <w:szCs w:val="28"/>
               </w:rPr>
@@ -2933,7 +2873,6 @@
             </w:r>
             <w:r>
               <w:rPr>
-                <w:noProof/>
                 <w:webHidden/>
                 <w:sz w:val="28"/>
                 <w:szCs w:val="28"/>
@@ -2942,7 +2881,6 @@
             </w:r>
             <w:r>
               <w:rPr>
-                <w:noProof/>
                 <w:webHidden/>
                 <w:sz w:val="28"/>
                 <w:szCs w:val="28"/>
@@ -2951,7 +2889,6 @@
             </w:r>
             <w:r>
               <w:rPr>
-                <w:noProof/>
                 <w:webHidden/>
                 <w:sz w:val="28"/>
                 <w:szCs w:val="28"/>
@@ -2960,7 +2897,6 @@
             </w:r>
             <w:r>
               <w:rPr>
-                <w:noProof/>
                 <w:webHidden/>
                 <w:sz w:val="28"/>
                 <w:szCs w:val="28"/>
@@ -2968,7 +2904,6 @@
             </w:r>
             <w:r>
               <w:rPr>
-                <w:noProof/>
                 <w:webHidden/>
                 <w:sz w:val="28"/>
                 <w:szCs w:val="28"/>
@@ -2977,7 +2912,6 @@
             </w:r>
             <w:r>
               <w:rPr>
-                <w:noProof/>
                 <w:webHidden/>
                 <w:sz w:val="28"/>
                 <w:szCs w:val="28"/>
@@ -2986,7 +2920,6 @@
             </w:r>
             <w:r>
               <w:rPr>
-                <w:noProof/>
                 <w:webHidden/>
                 <w:sz w:val="28"/>
                 <w:szCs w:val="28"/>
@@ -3000,7 +2933,6 @@
             <w:pStyle w:val="TOC2"/>
             <w:rPr>
               <w:rFonts w:asciiTheme="minorHAnsi" w:eastAsiaTheme="minorEastAsia" w:hAnsiTheme="minorHAnsi" w:cstheme="minorBidi"/>
-              <w:noProof/>
               <w:kern w:val="2"/>
               <w:sz w:val="28"/>
               <w:szCs w:val="28"/>
@@ -3011,7 +2943,6 @@
             <w:r>
               <w:rPr>
                 <w:rStyle w:val="Hyperlink"/>
-                <w:noProof/>
                 <w:sz w:val="28"/>
                 <w:szCs w:val="28"/>
               </w:rPr>
@@ -3020,7 +2951,6 @@
             <w:r>
               <w:rPr>
                 <w:rFonts w:asciiTheme="minorHAnsi" w:eastAsiaTheme="minorEastAsia" w:hAnsiTheme="minorHAnsi" w:cstheme="minorBidi"/>
-                <w:noProof/>
                 <w:kern w:val="2"/>
                 <w:sz w:val="28"/>
                 <w:szCs w:val="28"/>
@@ -3031,7 +2961,6 @@
             <w:r>
               <w:rPr>
                 <w:rStyle w:val="Hyperlink"/>
-                <w:noProof/>
                 <w:sz w:val="28"/>
                 <w:szCs w:val="28"/>
               </w:rPr>
@@ -3039,7 +2968,6 @@
             </w:r>
             <w:r>
               <w:rPr>
-                <w:noProof/>
                 <w:webHidden/>
                 <w:sz w:val="28"/>
                 <w:szCs w:val="28"/>
@@ -3048,7 +2976,6 @@
             </w:r>
             <w:r>
               <w:rPr>
-                <w:noProof/>
                 <w:webHidden/>
                 <w:sz w:val="28"/>
                 <w:szCs w:val="28"/>
@@ -3057,7 +2984,6 @@
             </w:r>
             <w:r>
               <w:rPr>
-                <w:noProof/>
                 <w:webHidden/>
                 <w:sz w:val="28"/>
                 <w:szCs w:val="28"/>
@@ -3066,7 +2992,6 @@
             </w:r>
             <w:r>
               <w:rPr>
-                <w:noProof/>
                 <w:webHidden/>
                 <w:sz w:val="28"/>
                 <w:szCs w:val="28"/>
@@ -3074,7 +2999,6 @@
             </w:r>
             <w:r>
               <w:rPr>
-                <w:noProof/>
                 <w:webHidden/>
                 <w:sz w:val="28"/>
                 <w:szCs w:val="28"/>
@@ -3083,7 +3007,6 @@
             </w:r>
             <w:r>
               <w:rPr>
-                <w:noProof/>
                 <w:webHidden/>
                 <w:sz w:val="28"/>
                 <w:szCs w:val="28"/>
@@ -3092,7 +3015,6 @@
             </w:r>
             <w:r>
               <w:rPr>
-                <w:noProof/>
                 <w:webHidden/>
                 <w:sz w:val="28"/>
                 <w:szCs w:val="28"/>
@@ -3106,7 +3028,6 @@
             <w:pStyle w:val="TOC2"/>
             <w:rPr>
               <w:rFonts w:asciiTheme="minorHAnsi" w:eastAsiaTheme="minorEastAsia" w:hAnsiTheme="minorHAnsi" w:cstheme="minorBidi"/>
-              <w:noProof/>
               <w:kern w:val="2"/>
               <w:sz w:val="28"/>
               <w:szCs w:val="28"/>
@@ -3117,7 +3038,6 @@
             <w:r>
               <w:rPr>
                 <w:rStyle w:val="Hyperlink"/>
-                <w:noProof/>
                 <w:sz w:val="28"/>
                 <w:szCs w:val="28"/>
               </w:rPr>
@@ -3126,7 +3046,6 @@
             <w:r>
               <w:rPr>
                 <w:rFonts w:asciiTheme="minorHAnsi" w:eastAsiaTheme="minorEastAsia" w:hAnsiTheme="minorHAnsi" w:cstheme="minorBidi"/>
-                <w:noProof/>
                 <w:kern w:val="2"/>
                 <w:sz w:val="28"/>
                 <w:szCs w:val="28"/>
@@ -3137,7 +3056,6 @@
             <w:r>
               <w:rPr>
                 <w:rStyle w:val="Hyperlink"/>
-                <w:noProof/>
                 <w:sz w:val="28"/>
                 <w:szCs w:val="28"/>
               </w:rPr>
@@ -3145,7 +3063,6 @@
             </w:r>
             <w:r>
               <w:rPr>
-                <w:noProof/>
                 <w:webHidden/>
                 <w:sz w:val="28"/>
                 <w:szCs w:val="28"/>
@@ -3154,7 +3071,6 @@
             </w:r>
             <w:r>
               <w:rPr>
-                <w:noProof/>
                 <w:webHidden/>
                 <w:sz w:val="28"/>
                 <w:szCs w:val="28"/>
@@ -3163,7 +3079,6 @@
             </w:r>
             <w:r>
               <w:rPr>
-                <w:noProof/>
                 <w:webHidden/>
                 <w:sz w:val="28"/>
                 <w:szCs w:val="28"/>
@@ -3172,7 +3087,6 @@
             </w:r>
             <w:r>
               <w:rPr>
-                <w:noProof/>
                 <w:webHidden/>
                 <w:sz w:val="28"/>
                 <w:szCs w:val="28"/>
@@ -3180,7 +3094,6 @@
             </w:r>
             <w:r>
               <w:rPr>
-                <w:noProof/>
                 <w:webHidden/>
                 <w:sz w:val="28"/>
                 <w:szCs w:val="28"/>
@@ -3189,7 +3102,6 @@
             </w:r>
             <w:r>
               <w:rPr>
-                <w:noProof/>
                 <w:webHidden/>
                 <w:sz w:val="28"/>
                 <w:szCs w:val="28"/>
@@ -3198,7 +3110,6 @@
             </w:r>
             <w:r>
               <w:rPr>
-                <w:noProof/>
                 <w:webHidden/>
                 <w:sz w:val="28"/>
                 <w:szCs w:val="28"/>
@@ -3212,7 +3123,6 @@
             <w:pStyle w:val="TOC2"/>
             <w:rPr>
               <w:rFonts w:asciiTheme="minorHAnsi" w:eastAsiaTheme="minorEastAsia" w:hAnsiTheme="minorHAnsi" w:cstheme="minorBidi"/>
-              <w:noProof/>
               <w:kern w:val="2"/>
               <w:sz w:val="28"/>
               <w:szCs w:val="28"/>
@@ -3223,7 +3133,6 @@
             <w:r>
               <w:rPr>
                 <w:rStyle w:val="Hyperlink"/>
-                <w:noProof/>
                 <w:sz w:val="28"/>
                 <w:szCs w:val="28"/>
               </w:rPr>
@@ -3232,7 +3141,6 @@
             <w:r>
               <w:rPr>
                 <w:rFonts w:asciiTheme="minorHAnsi" w:eastAsiaTheme="minorEastAsia" w:hAnsiTheme="minorHAnsi" w:cstheme="minorBidi"/>
-                <w:noProof/>
                 <w:kern w:val="2"/>
                 <w:sz w:val="28"/>
                 <w:szCs w:val="28"/>
@@ -3243,7 +3151,6 @@
             <w:r>
               <w:rPr>
                 <w:rStyle w:val="Hyperlink"/>
-                <w:noProof/>
                 <w:sz w:val="28"/>
                 <w:szCs w:val="28"/>
               </w:rPr>
@@ -3251,7 +3158,6 @@
             </w:r>
             <w:r>
               <w:rPr>
-                <w:noProof/>
                 <w:webHidden/>
                 <w:sz w:val="28"/>
                 <w:szCs w:val="28"/>
@@ -3260,7 +3166,6 @@
             </w:r>
             <w:r>
               <w:rPr>
-                <w:noProof/>
                 <w:webHidden/>
                 <w:sz w:val="28"/>
                 <w:szCs w:val="28"/>
@@ -3269,7 +3174,6 @@
             </w:r>
             <w:r>
               <w:rPr>
-                <w:noProof/>
                 <w:webHidden/>
                 <w:sz w:val="28"/>
                 <w:szCs w:val="28"/>
@@ -3278,7 +3182,6 @@
             </w:r>
             <w:r>
               <w:rPr>
-                <w:noProof/>
                 <w:webHidden/>
                 <w:sz w:val="28"/>
                 <w:szCs w:val="28"/>
@@ -3286,7 +3189,6 @@
             </w:r>
             <w:r>
               <w:rPr>
-                <w:noProof/>
                 <w:webHidden/>
                 <w:sz w:val="28"/>
                 <w:szCs w:val="28"/>
@@ -3295,7 +3197,6 @@
             </w:r>
             <w:r>
               <w:rPr>
-                <w:noProof/>
                 <w:webHidden/>
                 <w:sz w:val="28"/>
                 <w:szCs w:val="28"/>
@@ -3304,7 +3205,6 @@
             </w:r>
             <w:r>
               <w:rPr>
-                <w:noProof/>
                 <w:webHidden/>
                 <w:sz w:val="28"/>
                 <w:szCs w:val="28"/>
@@ -3318,7 +3218,6 @@
             <w:pStyle w:val="TOC1"/>
             <w:rPr>
               <w:rFonts w:asciiTheme="minorHAnsi" w:eastAsiaTheme="minorEastAsia" w:hAnsiTheme="minorHAnsi" w:cstheme="minorBidi"/>
-              <w:noProof/>
               <w:kern w:val="2"/>
               <w:sz w:val="28"/>
               <w:szCs w:val="28"/>
@@ -3329,7 +3228,6 @@
             <w:r>
               <w:rPr>
                 <w:rStyle w:val="Hyperlink"/>
-                <w:noProof/>
                 <w:sz w:val="28"/>
                 <w:szCs w:val="28"/>
               </w:rPr>
@@ -3338,7 +3236,6 @@
             <w:r>
               <w:rPr>
                 <w:rFonts w:asciiTheme="minorHAnsi" w:eastAsiaTheme="minorEastAsia" w:hAnsiTheme="minorHAnsi" w:cstheme="minorBidi"/>
-                <w:noProof/>
                 <w:kern w:val="2"/>
                 <w:sz w:val="28"/>
                 <w:szCs w:val="28"/>
@@ -3349,7 +3246,6 @@
             <w:r>
               <w:rPr>
                 <w:rStyle w:val="Hyperlink"/>
-                <w:noProof/>
                 <w:sz w:val="28"/>
                 <w:szCs w:val="28"/>
               </w:rPr>
@@ -3357,7 +3253,6 @@
             </w:r>
             <w:r>
               <w:rPr>
-                <w:noProof/>
                 <w:webHidden/>
                 <w:sz w:val="28"/>
                 <w:szCs w:val="28"/>
@@ -3366,7 +3261,6 @@
             </w:r>
             <w:r>
               <w:rPr>
-                <w:noProof/>
                 <w:webHidden/>
                 <w:sz w:val="28"/>
                 <w:szCs w:val="28"/>
@@ -3375,7 +3269,6 @@
             </w:r>
             <w:r>
               <w:rPr>
-                <w:noProof/>
                 <w:webHidden/>
                 <w:sz w:val="28"/>
                 <w:szCs w:val="28"/>
@@ -3384,7 +3277,6 @@
             </w:r>
             <w:r>
               <w:rPr>
-                <w:noProof/>
                 <w:webHidden/>
                 <w:sz w:val="28"/>
                 <w:szCs w:val="28"/>
@@ -3392,7 +3284,6 @@
             </w:r>
             <w:r>
               <w:rPr>
-                <w:noProof/>
                 <w:webHidden/>
                 <w:sz w:val="28"/>
                 <w:szCs w:val="28"/>
@@ -3401,7 +3292,6 @@
             </w:r>
             <w:r>
               <w:rPr>
-                <w:noProof/>
                 <w:webHidden/>
                 <w:sz w:val="28"/>
                 <w:szCs w:val="28"/>
@@ -3410,7 +3300,6 @@
             </w:r>
             <w:r>
               <w:rPr>
-                <w:noProof/>
                 <w:webHidden/>
                 <w:sz w:val="28"/>
                 <w:szCs w:val="28"/>
@@ -3424,7 +3313,6 @@
             <w:pStyle w:val="TOC2"/>
             <w:rPr>
               <w:rFonts w:asciiTheme="minorHAnsi" w:eastAsiaTheme="minorEastAsia" w:hAnsiTheme="minorHAnsi" w:cstheme="minorBidi"/>
-              <w:noProof/>
               <w:kern w:val="2"/>
               <w:sz w:val="28"/>
               <w:szCs w:val="28"/>
@@ -3435,7 +3323,6 @@
             <w:r>
               <w:rPr>
                 <w:rStyle w:val="Hyperlink"/>
-                <w:noProof/>
                 <w:sz w:val="28"/>
                 <w:szCs w:val="28"/>
               </w:rPr>
@@ -3444,7 +3331,6 @@
             <w:r>
               <w:rPr>
                 <w:rFonts w:asciiTheme="minorHAnsi" w:eastAsiaTheme="minorEastAsia" w:hAnsiTheme="minorHAnsi" w:cstheme="minorBidi"/>
-                <w:noProof/>
                 <w:kern w:val="2"/>
                 <w:sz w:val="28"/>
                 <w:szCs w:val="28"/>
@@ -3455,7 +3341,6 @@
             <w:r>
               <w:rPr>
                 <w:rStyle w:val="Hyperlink"/>
-                <w:noProof/>
                 <w:sz w:val="28"/>
                 <w:szCs w:val="28"/>
               </w:rPr>
@@ -3463,7 +3348,6 @@
             </w:r>
             <w:r>
               <w:rPr>
-                <w:noProof/>
                 <w:webHidden/>
                 <w:sz w:val="28"/>
                 <w:szCs w:val="28"/>
@@ -3472,7 +3356,6 @@
             </w:r>
             <w:r>
               <w:rPr>
-                <w:noProof/>
                 <w:webHidden/>
                 <w:sz w:val="28"/>
                 <w:szCs w:val="28"/>
@@ -3481,7 +3364,6 @@
             </w:r>
             <w:r>
               <w:rPr>
-                <w:noProof/>
                 <w:webHidden/>
                 <w:sz w:val="28"/>
                 <w:szCs w:val="28"/>
@@ -3490,7 +3372,6 @@
             </w:r>
             <w:r>
               <w:rPr>
-                <w:noProof/>
                 <w:webHidden/>
                 <w:sz w:val="28"/>
                 <w:szCs w:val="28"/>
@@ -3498,7 +3379,6 @@
             </w:r>
             <w:r>
               <w:rPr>
-                <w:noProof/>
                 <w:webHidden/>
                 <w:sz w:val="28"/>
                 <w:szCs w:val="28"/>
@@ -3507,7 +3387,6 @@
             </w:r>
             <w:r>
               <w:rPr>
-                <w:noProof/>
                 <w:webHidden/>
                 <w:sz w:val="28"/>
                 <w:szCs w:val="28"/>
@@ -3516,7 +3395,6 @@
             </w:r>
             <w:r>
               <w:rPr>
-                <w:noProof/>
                 <w:webHidden/>
                 <w:sz w:val="28"/>
                 <w:szCs w:val="28"/>
@@ -3530,7 +3408,6 @@
             <w:pStyle w:val="TOC2"/>
             <w:rPr>
               <w:rFonts w:asciiTheme="minorHAnsi" w:eastAsiaTheme="minorEastAsia" w:hAnsiTheme="minorHAnsi" w:cstheme="minorBidi"/>
-              <w:noProof/>
               <w:kern w:val="2"/>
               <w:sz w:val="28"/>
               <w:szCs w:val="28"/>
@@ -3541,7 +3418,6 @@
             <w:r>
               <w:rPr>
                 <w:rStyle w:val="Hyperlink"/>
-                <w:noProof/>
                 <w:sz w:val="28"/>
                 <w:szCs w:val="28"/>
               </w:rPr>
@@ -3550,7 +3426,6 @@
             <w:r>
               <w:rPr>
                 <w:rFonts w:asciiTheme="minorHAnsi" w:eastAsiaTheme="minorEastAsia" w:hAnsiTheme="minorHAnsi" w:cstheme="minorBidi"/>
-                <w:noProof/>
                 <w:kern w:val="2"/>
                 <w:sz w:val="28"/>
                 <w:szCs w:val="28"/>
@@ -3561,7 +3436,6 @@
             <w:r>
               <w:rPr>
                 <w:rStyle w:val="Hyperlink"/>
-                <w:noProof/>
                 <w:sz w:val="28"/>
                 <w:szCs w:val="28"/>
               </w:rPr>
@@ -3569,7 +3443,6 @@
             </w:r>
             <w:r>
               <w:rPr>
-                <w:noProof/>
                 <w:webHidden/>
                 <w:sz w:val="28"/>
                 <w:szCs w:val="28"/>
@@ -3578,7 +3451,6 @@
             </w:r>
             <w:r>
               <w:rPr>
-                <w:noProof/>
                 <w:webHidden/>
                 <w:sz w:val="28"/>
                 <w:szCs w:val="28"/>
@@ -3587,7 +3459,6 @@
             </w:r>
             <w:r>
               <w:rPr>
-                <w:noProof/>
                 <w:webHidden/>
                 <w:sz w:val="28"/>
                 <w:szCs w:val="28"/>
@@ -3596,7 +3467,6 @@
             </w:r>
             <w:r>
               <w:rPr>
-                <w:noProof/>
                 <w:webHidden/>
                 <w:sz w:val="28"/>
                 <w:szCs w:val="28"/>
@@ -3604,7 +3474,6 @@
             </w:r>
             <w:r>
               <w:rPr>
-                <w:noProof/>
                 <w:webHidden/>
                 <w:sz w:val="28"/>
                 <w:szCs w:val="28"/>
@@ -3613,7 +3482,6 @@
             </w:r>
             <w:r>
               <w:rPr>
-                <w:noProof/>
                 <w:webHidden/>
                 <w:sz w:val="28"/>
                 <w:szCs w:val="28"/>
@@ -3622,7 +3490,6 @@
             </w:r>
             <w:r>
               <w:rPr>
-                <w:noProof/>
                 <w:webHidden/>
                 <w:sz w:val="28"/>
                 <w:szCs w:val="28"/>
@@ -3636,7 +3503,6 @@
             <w:pStyle w:val="TOC1"/>
             <w:rPr>
               <w:rFonts w:asciiTheme="minorHAnsi" w:eastAsiaTheme="minorEastAsia" w:hAnsiTheme="minorHAnsi" w:cstheme="minorBidi"/>
-              <w:noProof/>
               <w:kern w:val="2"/>
               <w:sz w:val="28"/>
               <w:szCs w:val="28"/>
@@ -3647,7 +3513,6 @@
             <w:r>
               <w:rPr>
                 <w:rStyle w:val="Hyperlink"/>
-                <w:noProof/>
                 <w:sz w:val="28"/>
                 <w:szCs w:val="28"/>
               </w:rPr>
@@ -3656,7 +3521,6 @@
             <w:r>
               <w:rPr>
                 <w:rFonts w:asciiTheme="minorHAnsi" w:eastAsiaTheme="minorEastAsia" w:hAnsiTheme="minorHAnsi" w:cstheme="minorBidi"/>
-                <w:noProof/>
                 <w:kern w:val="2"/>
                 <w:sz w:val="28"/>
                 <w:szCs w:val="28"/>
@@ -3667,7 +3531,6 @@
             <w:r>
               <w:rPr>
                 <w:rStyle w:val="Hyperlink"/>
-                <w:noProof/>
                 <w:sz w:val="28"/>
                 <w:szCs w:val="28"/>
               </w:rPr>
@@ -3675,7 +3538,6 @@
             </w:r>
             <w:r>
               <w:rPr>
-                <w:noProof/>
                 <w:webHidden/>
                 <w:sz w:val="28"/>
                 <w:szCs w:val="28"/>
@@ -3684,7 +3546,6 @@
             </w:r>
             <w:r>
               <w:rPr>
-                <w:noProof/>
                 <w:webHidden/>
                 <w:sz w:val="28"/>
                 <w:szCs w:val="28"/>
@@ -3693,7 +3554,6 @@
             </w:r>
             <w:r>
               <w:rPr>
-                <w:noProof/>
                 <w:webHidden/>
                 <w:sz w:val="28"/>
                 <w:szCs w:val="28"/>
@@ -3702,7 +3562,6 @@
             </w:r>
             <w:r>
               <w:rPr>
-                <w:noProof/>
                 <w:webHidden/>
                 <w:sz w:val="28"/>
                 <w:szCs w:val="28"/>
@@ -3710,7 +3569,6 @@
             </w:r>
             <w:r>
               <w:rPr>
-                <w:noProof/>
                 <w:webHidden/>
                 <w:sz w:val="28"/>
                 <w:szCs w:val="28"/>
@@ -3719,7 +3577,6 @@
             </w:r>
             <w:r>
               <w:rPr>
-                <w:noProof/>
                 <w:webHidden/>
                 <w:sz w:val="28"/>
                 <w:szCs w:val="28"/>
@@ -3728,7 +3585,6 @@
             </w:r>
             <w:r>
               <w:rPr>
-                <w:noProof/>
                 <w:webHidden/>
                 <w:sz w:val="28"/>
                 <w:szCs w:val="28"/>
@@ -3742,7 +3598,6 @@
             <w:pStyle w:val="TOC2"/>
             <w:rPr>
               <w:rFonts w:asciiTheme="minorHAnsi" w:eastAsiaTheme="minorEastAsia" w:hAnsiTheme="minorHAnsi" w:cstheme="minorBidi"/>
-              <w:noProof/>
               <w:kern w:val="2"/>
               <w:sz w:val="28"/>
               <w:szCs w:val="28"/>
@@ -3753,7 +3608,6 @@
             <w:r>
               <w:rPr>
                 <w:rStyle w:val="Hyperlink"/>
-                <w:noProof/>
                 <w:sz w:val="28"/>
                 <w:szCs w:val="28"/>
               </w:rPr>
@@ -3762,7 +3616,6 @@
             <w:r>
               <w:rPr>
                 <w:rFonts w:asciiTheme="minorHAnsi" w:eastAsiaTheme="minorEastAsia" w:hAnsiTheme="minorHAnsi" w:cstheme="minorBidi"/>
-                <w:noProof/>
                 <w:kern w:val="2"/>
                 <w:sz w:val="28"/>
                 <w:szCs w:val="28"/>
@@ -3773,7 +3626,6 @@
             <w:r>
               <w:rPr>
                 <w:rStyle w:val="Hyperlink"/>
-                <w:noProof/>
                 <w:sz w:val="28"/>
                 <w:szCs w:val="28"/>
               </w:rPr>
@@ -3781,7 +3633,6 @@
             </w:r>
             <w:r>
               <w:rPr>
-                <w:noProof/>
                 <w:webHidden/>
                 <w:sz w:val="28"/>
                 <w:szCs w:val="28"/>
@@ -3790,7 +3641,6 @@
             </w:r>
             <w:r>
               <w:rPr>
-                <w:noProof/>
                 <w:webHidden/>
                 <w:sz w:val="28"/>
                 <w:szCs w:val="28"/>
@@ -3799,7 +3649,6 @@
             </w:r>
             <w:r>
               <w:rPr>
-                <w:noProof/>
                 <w:webHidden/>
                 <w:sz w:val="28"/>
                 <w:szCs w:val="28"/>
@@ -3808,7 +3657,6 @@
             </w:r>
             <w:r>
               <w:rPr>
-                <w:noProof/>
                 <w:webHidden/>
                 <w:sz w:val="28"/>
                 <w:szCs w:val="28"/>
@@ -3816,7 +3664,6 @@
             </w:r>
             <w:r>
               <w:rPr>
-                <w:noProof/>
                 <w:webHidden/>
                 <w:sz w:val="28"/>
                 <w:szCs w:val="28"/>
@@ -3825,7 +3672,6 @@
             </w:r>
             <w:r>
               <w:rPr>
-                <w:noProof/>
                 <w:webHidden/>
                 <w:sz w:val="28"/>
                 <w:szCs w:val="28"/>
@@ -3834,7 +3680,6 @@
             </w:r>
             <w:r>
               <w:rPr>
-                <w:noProof/>
                 <w:webHidden/>
                 <w:sz w:val="28"/>
                 <w:szCs w:val="28"/>
@@ -3848,7 +3693,6 @@
             <w:pStyle w:val="TOC2"/>
             <w:rPr>
               <w:rFonts w:asciiTheme="minorHAnsi" w:eastAsiaTheme="minorEastAsia" w:hAnsiTheme="minorHAnsi" w:cstheme="minorBidi"/>
-              <w:noProof/>
               <w:kern w:val="2"/>
               <w:sz w:val="28"/>
               <w:szCs w:val="28"/>
@@ -3859,7 +3703,6 @@
             <w:r>
               <w:rPr>
                 <w:rStyle w:val="Hyperlink"/>
-                <w:noProof/>
                 <w:sz w:val="28"/>
                 <w:szCs w:val="28"/>
               </w:rPr>
@@ -3868,7 +3711,6 @@
             <w:r>
               <w:rPr>
                 <w:rFonts w:asciiTheme="minorHAnsi" w:eastAsiaTheme="minorEastAsia" w:hAnsiTheme="minorHAnsi" w:cstheme="minorBidi"/>
-                <w:noProof/>
                 <w:kern w:val="2"/>
                 <w:sz w:val="28"/>
                 <w:szCs w:val="28"/>
@@ -3879,7 +3721,6 @@
             <w:r>
               <w:rPr>
                 <w:rStyle w:val="Hyperlink"/>
-                <w:noProof/>
                 <w:sz w:val="28"/>
                 <w:szCs w:val="28"/>
               </w:rPr>
@@ -3887,7 +3728,6 @@
             </w:r>
             <w:r>
               <w:rPr>
-                <w:noProof/>
                 <w:webHidden/>
                 <w:sz w:val="28"/>
                 <w:szCs w:val="28"/>
@@ -3896,7 +3736,6 @@
             </w:r>
             <w:r>
               <w:rPr>
-                <w:noProof/>
                 <w:webHidden/>
                 <w:sz w:val="28"/>
                 <w:szCs w:val="28"/>
@@ -3905,7 +3744,6 @@
             </w:r>
             <w:r>
               <w:rPr>
-                <w:noProof/>
                 <w:webHidden/>
                 <w:sz w:val="28"/>
                 <w:szCs w:val="28"/>
@@ -3914,7 +3752,6 @@
             </w:r>
             <w:r>
               <w:rPr>
-                <w:noProof/>
                 <w:webHidden/>
                 <w:sz w:val="28"/>
                 <w:szCs w:val="28"/>
@@ -3922,7 +3759,6 @@
             </w:r>
             <w:r>
               <w:rPr>
-                <w:noProof/>
                 <w:webHidden/>
                 <w:sz w:val="28"/>
                 <w:szCs w:val="28"/>
@@ -3931,7 +3767,6 @@
             </w:r>
             <w:r>
               <w:rPr>
-                <w:noProof/>
                 <w:webHidden/>
                 <w:sz w:val="28"/>
                 <w:szCs w:val="28"/>
@@ -3940,7 +3775,6 @@
             </w:r>
             <w:r>
               <w:rPr>
-                <w:noProof/>
                 <w:webHidden/>
                 <w:sz w:val="28"/>
                 <w:szCs w:val="28"/>
@@ -3954,7 +3788,6 @@
             <w:pStyle w:val="TOC2"/>
             <w:rPr>
               <w:rFonts w:asciiTheme="minorHAnsi" w:eastAsiaTheme="minorEastAsia" w:hAnsiTheme="minorHAnsi" w:cstheme="minorBidi"/>
-              <w:noProof/>
               <w:kern w:val="2"/>
               <w:sz w:val="28"/>
               <w:szCs w:val="28"/>
@@ -3965,7 +3798,6 @@
             <w:r>
               <w:rPr>
                 <w:rStyle w:val="Hyperlink"/>
-                <w:noProof/>
                 <w:sz w:val="28"/>
                 <w:szCs w:val="28"/>
               </w:rPr>
@@ -3974,7 +3806,6 @@
             <w:r>
               <w:rPr>
                 <w:rFonts w:asciiTheme="minorHAnsi" w:eastAsiaTheme="minorEastAsia" w:hAnsiTheme="minorHAnsi" w:cstheme="minorBidi"/>
-                <w:noProof/>
                 <w:kern w:val="2"/>
                 <w:sz w:val="28"/>
                 <w:szCs w:val="28"/>
@@ -3985,7 +3816,6 @@
             <w:r>
               <w:rPr>
                 <w:rStyle w:val="Hyperlink"/>
-                <w:noProof/>
                 <w:sz w:val="28"/>
                 <w:szCs w:val="28"/>
               </w:rPr>
@@ -3993,7 +3823,6 @@
             </w:r>
             <w:r>
               <w:rPr>
-                <w:noProof/>
                 <w:webHidden/>
                 <w:sz w:val="28"/>
                 <w:szCs w:val="28"/>
@@ -4002,7 +3831,6 @@
             </w:r>
             <w:r>
               <w:rPr>
-                <w:noProof/>
                 <w:webHidden/>
                 <w:sz w:val="28"/>
                 <w:szCs w:val="28"/>
@@ -4011,7 +3839,6 @@
             </w:r>
             <w:r>
               <w:rPr>
-                <w:noProof/>
                 <w:webHidden/>
                 <w:sz w:val="28"/>
                 <w:szCs w:val="28"/>
@@ -4020,7 +3847,6 @@
             </w:r>
             <w:r>
               <w:rPr>
-                <w:noProof/>
                 <w:webHidden/>
                 <w:sz w:val="28"/>
                 <w:szCs w:val="28"/>
@@ -4028,7 +3854,6 @@
             </w:r>
             <w:r>
               <w:rPr>
-                <w:noProof/>
                 <w:webHidden/>
                 <w:sz w:val="28"/>
                 <w:szCs w:val="28"/>
@@ -4037,7 +3862,6 @@
             </w:r>
             <w:r>
               <w:rPr>
-                <w:noProof/>
                 <w:webHidden/>
                 <w:sz w:val="28"/>
                 <w:szCs w:val="28"/>
@@ -4046,7 +3870,6 @@
             </w:r>
             <w:r>
               <w:rPr>
-                <w:noProof/>
                 <w:webHidden/>
                 <w:sz w:val="28"/>
                 <w:szCs w:val="28"/>
@@ -4060,7 +3883,6 @@
             <w:pStyle w:val="TOC1"/>
             <w:rPr>
               <w:rFonts w:asciiTheme="minorHAnsi" w:eastAsiaTheme="minorEastAsia" w:hAnsiTheme="minorHAnsi" w:cstheme="minorBidi"/>
-              <w:noProof/>
               <w:kern w:val="2"/>
               <w:sz w:val="28"/>
               <w:szCs w:val="28"/>
@@ -4071,7 +3893,6 @@
             <w:r>
               <w:rPr>
                 <w:rStyle w:val="Hyperlink"/>
-                <w:noProof/>
                 <w:sz w:val="28"/>
                 <w:szCs w:val="28"/>
               </w:rPr>
@@ -4080,7 +3901,6 @@
             <w:r>
               <w:rPr>
                 <w:rFonts w:asciiTheme="minorHAnsi" w:eastAsiaTheme="minorEastAsia" w:hAnsiTheme="minorHAnsi" w:cstheme="minorBidi"/>
-                <w:noProof/>
                 <w:kern w:val="2"/>
                 <w:sz w:val="28"/>
                 <w:szCs w:val="28"/>
@@ -4091,7 +3911,6 @@
             <w:r>
               <w:rPr>
                 <w:rStyle w:val="Hyperlink"/>
-                <w:noProof/>
                 <w:sz w:val="28"/>
                 <w:szCs w:val="28"/>
               </w:rPr>
@@ -4099,7 +3918,6 @@
             </w:r>
             <w:r>
               <w:rPr>
-                <w:noProof/>
                 <w:webHidden/>
                 <w:sz w:val="28"/>
                 <w:szCs w:val="28"/>
@@ -4108,7 +3926,6 @@
             </w:r>
             <w:r>
               <w:rPr>
-                <w:noProof/>
                 <w:webHidden/>
                 <w:sz w:val="28"/>
                 <w:szCs w:val="28"/>
@@ -4117,7 +3934,6 @@
             </w:r>
             <w:r>
               <w:rPr>
-                <w:noProof/>
                 <w:webHidden/>
                 <w:sz w:val="28"/>
                 <w:szCs w:val="28"/>
@@ -4126,7 +3942,6 @@
             </w:r>
             <w:r>
               <w:rPr>
-                <w:noProof/>
                 <w:webHidden/>
                 <w:sz w:val="28"/>
                 <w:szCs w:val="28"/>
@@ -4134,7 +3949,6 @@
             </w:r>
             <w:r>
               <w:rPr>
-                <w:noProof/>
                 <w:webHidden/>
                 <w:sz w:val="28"/>
                 <w:szCs w:val="28"/>
@@ -4143,7 +3957,6 @@
             </w:r>
             <w:r>
               <w:rPr>
-                <w:noProof/>
                 <w:webHidden/>
                 <w:sz w:val="28"/>
                 <w:szCs w:val="28"/>
@@ -4152,7 +3965,6 @@
             </w:r>
             <w:r>
               <w:rPr>
-                <w:noProof/>
                 <w:webHidden/>
                 <w:sz w:val="28"/>
                 <w:szCs w:val="28"/>
@@ -4166,7 +3978,6 @@
             <w:pStyle w:val="TOC1"/>
             <w:rPr>
               <w:rFonts w:asciiTheme="minorHAnsi" w:eastAsiaTheme="minorEastAsia" w:hAnsiTheme="minorHAnsi" w:cstheme="minorBidi"/>
-              <w:noProof/>
               <w:kern w:val="2"/>
               <w:sz w:val="28"/>
               <w:szCs w:val="28"/>
@@ -4177,7 +3988,6 @@
             <w:r>
               <w:rPr>
                 <w:rStyle w:val="Hyperlink"/>
-                <w:noProof/>
                 <w:sz w:val="28"/>
                 <w:szCs w:val="28"/>
               </w:rPr>
@@ -4185,7 +3995,6 @@
             </w:r>
             <w:r>
               <w:rPr>
-                <w:noProof/>
                 <w:webHidden/>
                 <w:sz w:val="28"/>
                 <w:szCs w:val="28"/>
@@ -4194,7 +4003,6 @@
             </w:r>
             <w:r>
               <w:rPr>
-                <w:noProof/>
                 <w:webHidden/>
                 <w:sz w:val="28"/>
                 <w:szCs w:val="28"/>
@@ -4203,7 +4011,6 @@
             </w:r>
             <w:r>
               <w:rPr>
-                <w:noProof/>
                 <w:webHidden/>
                 <w:sz w:val="28"/>
                 <w:szCs w:val="28"/>
@@ -4212,7 +4019,6 @@
             </w:r>
             <w:r>
               <w:rPr>
-                <w:noProof/>
                 <w:webHidden/>
                 <w:sz w:val="28"/>
                 <w:szCs w:val="28"/>
@@ -4220,7 +4026,6 @@
             </w:r>
             <w:r>
               <w:rPr>
-                <w:noProof/>
                 <w:webHidden/>
                 <w:sz w:val="28"/>
                 <w:szCs w:val="28"/>
@@ -4229,7 +4034,6 @@
             </w:r>
             <w:r>
               <w:rPr>
-                <w:noProof/>
                 <w:webHidden/>
                 <w:sz w:val="28"/>
                 <w:szCs w:val="28"/>
@@ -4238,7 +4042,6 @@
             </w:r>
             <w:r>
               <w:rPr>
-                <w:noProof/>
                 <w:webHidden/>
                 <w:sz w:val="28"/>
                 <w:szCs w:val="28"/>
@@ -4252,7 +4055,6 @@
             <w:pStyle w:val="TOC1"/>
             <w:rPr>
               <w:rFonts w:asciiTheme="minorHAnsi" w:eastAsiaTheme="minorEastAsia" w:hAnsiTheme="minorHAnsi" w:cstheme="minorBidi"/>
-              <w:noProof/>
               <w:kern w:val="2"/>
               <w:sz w:val="28"/>
               <w:szCs w:val="28"/>
@@ -4263,7 +4065,6 @@
             <w:r>
               <w:rPr>
                 <w:rStyle w:val="Hyperlink"/>
-                <w:noProof/>
                 <w:sz w:val="28"/>
                 <w:szCs w:val="28"/>
               </w:rPr>
@@ -4271,7 +4072,6 @@
             </w:r>
             <w:r>
               <w:rPr>
-                <w:noProof/>
                 <w:webHidden/>
                 <w:sz w:val="28"/>
                 <w:szCs w:val="28"/>
@@ -4280,7 +4080,6 @@
             </w:r>
             <w:r>
               <w:rPr>
-                <w:noProof/>
                 <w:webHidden/>
                 <w:sz w:val="28"/>
                 <w:szCs w:val="28"/>
@@ -4289,7 +4088,6 @@
             </w:r>
             <w:r>
               <w:rPr>
-                <w:noProof/>
                 <w:webHidden/>
                 <w:sz w:val="28"/>
                 <w:szCs w:val="28"/>
@@ -4298,7 +4096,6 @@
             </w:r>
             <w:r>
               <w:rPr>
-                <w:noProof/>
                 <w:webHidden/>
                 <w:sz w:val="28"/>
                 <w:szCs w:val="28"/>
@@ -4306,7 +4103,6 @@
             </w:r>
             <w:r>
               <w:rPr>
-                <w:noProof/>
                 <w:webHidden/>
                 <w:sz w:val="28"/>
                 <w:szCs w:val="28"/>
@@ -4315,7 +4111,6 @@
             </w:r>
             <w:r>
               <w:rPr>
-                <w:noProof/>
                 <w:webHidden/>
                 <w:sz w:val="28"/>
                 <w:szCs w:val="28"/>
@@ -4324,7 +4119,6 @@
             </w:r>
             <w:r>
               <w:rPr>
-                <w:noProof/>
                 <w:webHidden/>
                 <w:sz w:val="28"/>
                 <w:szCs w:val="28"/>
@@ -4338,7 +4132,6 @@
             <w:pStyle w:val="TOC2"/>
             <w:rPr>
               <w:rFonts w:asciiTheme="minorHAnsi" w:eastAsiaTheme="minorEastAsia" w:hAnsiTheme="minorHAnsi" w:cstheme="minorBidi"/>
-              <w:noProof/>
               <w:kern w:val="2"/>
               <w:sz w:val="28"/>
               <w:szCs w:val="28"/>
@@ -4349,7 +4142,6 @@
             <w:r>
               <w:rPr>
                 <w:rStyle w:val="Hyperlink"/>
-                <w:noProof/>
                 <w:sz w:val="28"/>
                 <w:szCs w:val="28"/>
               </w:rPr>
@@ -4357,7 +4149,6 @@
             </w:r>
             <w:r>
               <w:rPr>
-                <w:noProof/>
                 <w:webHidden/>
                 <w:sz w:val="28"/>
                 <w:szCs w:val="28"/>
@@ -4366,7 +4157,6 @@
             </w:r>
             <w:r>
               <w:rPr>
-                <w:noProof/>
                 <w:webHidden/>
                 <w:sz w:val="28"/>
                 <w:szCs w:val="28"/>
@@ -4375,7 +4165,6 @@
             </w:r>
             <w:r>
               <w:rPr>
-                <w:noProof/>
                 <w:webHidden/>
                 <w:sz w:val="28"/>
                 <w:szCs w:val="28"/>
@@ -4384,7 +4173,6 @@
             </w:r>
             <w:r>
               <w:rPr>
-                <w:noProof/>
                 <w:webHidden/>
                 <w:sz w:val="28"/>
                 <w:szCs w:val="28"/>
@@ -4392,7 +4180,6 @@
             </w:r>
             <w:r>
               <w:rPr>
-                <w:noProof/>
                 <w:webHidden/>
                 <w:sz w:val="28"/>
                 <w:szCs w:val="28"/>
@@ -4401,7 +4188,6 @@
             </w:r>
             <w:r>
               <w:rPr>
-                <w:noProof/>
                 <w:webHidden/>
                 <w:sz w:val="28"/>
                 <w:szCs w:val="28"/>
@@ -4410,7 +4196,6 @@
             </w:r>
             <w:r>
               <w:rPr>
-                <w:noProof/>
                 <w:webHidden/>
                 <w:sz w:val="28"/>
                 <w:szCs w:val="28"/>
@@ -4880,7 +4665,6 @@
       <w:r>
         <w:rPr>
           <w:color w:val="FF0000"/>
-          <w:lang w:val="en-US"/>
         </w:rPr>
         <w:t>39</w:t>
       </w:r>
@@ -4902,7 +4686,6 @@
       <w:r>
         <w:rPr>
           <w:color w:val="FF0000"/>
-          <w:lang w:val="en-US"/>
         </w:rPr>
         <w:t>21</w:t>
       </w:r>
@@ -5006,15 +4789,11 @@
       <w:r>
         <w:rPr>
           <w:color w:val="FF0000"/>
-          <w:lang w:val="en-US"/>
         </w:rPr>
         <w:t xml:space="preserve"> </w:t>
       </w:r>
       <w:r>
-        <w:t>п</w:t>
-      </w:r>
-      <w:r>
-        <w:t xml:space="preserve">роведены </w:t>
+        <w:t xml:space="preserve">проведены </w:t>
       </w:r>
       <w:r>
         <w:t>вычислительные эксперименты системы, а также эксперименты поиска интересных шаблонов.</w:t>
@@ -6838,9 +6617,6 @@
         <w:ind w:firstLine="0"/>
       </w:pPr>
       <w:r>
-        <w:rPr>
-          <w:noProof/>
-        </w:rPr>
         <w:drawing>
           <wp:inline distT="0" distB="0" distL="0" distR="0" wp14:anchorId="4FE1B59F" wp14:editId="75C81F4C">
             <wp:extent cx="5759450" cy="4099560"/>
@@ -6902,9 +6678,6 @@
         <w:fldChar w:fldCharType="separate"/>
       </w:r>
       <w:r>
-        <w:rPr>
-          <w:noProof/>
-        </w:rPr>
         <w:t>1</w:t>
       </w:r>
       <w:r>
@@ -7035,9 +6808,6 @@
         <w:fldChar w:fldCharType="separate"/>
       </w:r>
       <w:r>
-        <w:rPr>
-          <w:noProof/>
-        </w:rPr>
         <w:t>1</w:t>
       </w:r>
       <w:r>
@@ -8302,9 +8072,6 @@
         <w:fldChar w:fldCharType="separate"/>
       </w:r>
       <w:r>
-        <w:rPr>
-          <w:noProof/>
-        </w:rPr>
         <w:t>2</w:t>
       </w:r>
       <w:r>
@@ -8780,9 +8547,6 @@
       <w:pPr>
         <w:pStyle w:val="a5"/>
         <w:ind w:firstLine="0"/>
-        <w:rPr>
-          <w:lang w:val="en-US"/>
-        </w:rPr>
       </w:pPr>
     </w:p>
     <w:p>
@@ -8860,9 +8624,6 @@
         <w:fldChar w:fldCharType="separate"/>
       </w:r>
       <w:r>
-        <w:rPr>
-          <w:noProof/>
-        </w:rPr>
         <w:t>3</w:t>
       </w:r>
       <w:r>
@@ -9786,9 +9547,6 @@
         <w:ind w:firstLine="0"/>
       </w:pPr>
       <w:r>
-        <w:rPr>
-          <w:noProof/>
-        </w:rPr>
         <w:drawing>
           <wp:inline distT="0" distB="0" distL="0" distR="0" wp14:anchorId="7C1B7C6D" wp14:editId="2F37C3A8">
             <wp:extent cx="5755640" cy="3327400"/>
@@ -9858,9 +9616,6 @@
         <w:fldChar w:fldCharType="separate"/>
       </w:r>
       <w:r>
-        <w:rPr>
-          <w:noProof/>
-        </w:rPr>
         <w:t>2</w:t>
       </w:r>
       <w:r>
@@ -10083,14 +9838,12 @@
       <w:r>
         <w:br/>
       </w:r>
-      <w:proofErr w:type="spellStart"/>
       <w:r>
         <w:rPr>
           <w:szCs w:val="28"/>
         </w:rPr>
-        <w:t>Cтраница</w:t>
-      </w:r>
-      <w:proofErr w:type="spellEnd"/>
+        <w:t>Страница</w:t>
+      </w:r>
       <w:r>
         <w:rPr>
           <w:szCs w:val="28"/>
@@ -10125,9 +9878,6 @@
         <w:ind w:firstLine="0"/>
       </w:pPr>
       <w:r>
-        <w:rPr>
-          <w:noProof/>
-        </w:rPr>
         <w:drawing>
           <wp:inline distT="0" distB="0" distL="0" distR="0" wp14:anchorId="337D2ABD" wp14:editId="6C1AEC98">
             <wp:extent cx="5759450" cy="3848100"/>
@@ -10189,9 +9939,6 @@
         <w:fldChar w:fldCharType="separate"/>
       </w:r>
       <w:r>
-        <w:rPr>
-          <w:noProof/>
-        </w:rPr>
         <w:t>3</w:t>
       </w:r>
       <w:r>
@@ -10365,9 +10112,6 @@
         <w:ind w:firstLine="0"/>
       </w:pPr>
       <w:r>
-        <w:rPr>
-          <w:noProof/>
-        </w:rPr>
         <w:drawing>
           <wp:inline distT="0" distB="0" distL="0" distR="0" wp14:anchorId="4FE7A572" wp14:editId="3DAC6884">
             <wp:extent cx="5759450" cy="6071507"/>
@@ -10429,9 +10173,6 @@
         <w:fldChar w:fldCharType="separate"/>
       </w:r>
       <w:r>
-        <w:rPr>
-          <w:noProof/>
-        </w:rPr>
         <w:t>4</w:t>
       </w:r>
       <w:r>
@@ -10900,9 +10641,6 @@
         <w:ind w:firstLine="0"/>
       </w:pPr>
       <w:r>
-        <w:rPr>
-          <w:noProof/>
-        </w:rPr>
         <w:drawing>
           <wp:inline distT="0" distB="0" distL="0" distR="0" wp14:anchorId="69119916" wp14:editId="51D59E82">
             <wp:extent cx="5753100" cy="3782695"/>
@@ -10972,9 +10710,6 @@
         <w:fldChar w:fldCharType="separate"/>
       </w:r>
       <w:r>
-        <w:rPr>
-          <w:noProof/>
-        </w:rPr>
         <w:t>5</w:t>
       </w:r>
       <w:r>
@@ -11001,10 +10736,7 @@
         <w:t xml:space="preserve">Ниже приведено подробнее описание реализации каждого модуля. Исходный код доступен в репозитории </w:t>
       </w:r>
       <w:r>
-        <w:t>https://github.com/Santiperro/final-qualifying-work</w:t>
-      </w:r>
-      <w:r>
-        <w:t xml:space="preserve">. </w:t>
+        <w:t xml:space="preserve">https://github.com/Santiperro/final-qualifying-work. </w:t>
       </w:r>
       <w:r>
         <w:t>Интерфейсы</w:t>
@@ -11438,9 +11170,6 @@
         <w:fldChar w:fldCharType="separate"/>
       </w:r>
       <w:r>
-        <w:rPr>
-          <w:noProof/>
-        </w:rPr>
         <w:t>4</w:t>
       </w:r>
       <w:r>
@@ -12826,9 +12555,6 @@
         <w:jc w:val="center"/>
       </w:pPr>
       <w:r>
-        <w:rPr>
-          <w:noProof/>
-        </w:rPr>
         <w:drawing>
           <wp:inline distT="0" distB="0" distL="0" distR="0" wp14:anchorId="015A7277" wp14:editId="25A491B2">
             <wp:extent cx="5753100" cy="6384290"/>
@@ -12898,9 +12624,6 @@
         <w:fldChar w:fldCharType="separate"/>
       </w:r>
       <w:r>
-        <w:rPr>
-          <w:noProof/>
-        </w:rPr>
         <w:t>6</w:t>
       </w:r>
       <w:r>
@@ -12984,9 +12707,6 @@
         <w:jc w:val="center"/>
       </w:pPr>
       <w:r>
-        <w:rPr>
-          <w:noProof/>
-        </w:rPr>
         <w:drawing>
           <wp:inline distT="0" distB="0" distL="0" distR="0" wp14:anchorId="4B07927A" wp14:editId="27275865">
             <wp:extent cx="5759450" cy="5260975"/>
@@ -13048,9 +12768,6 @@
         <w:fldChar w:fldCharType="separate"/>
       </w:r>
       <w:r>
-        <w:rPr>
-          <w:noProof/>
-        </w:rPr>
         <w:t>7</w:t>
       </w:r>
       <w:r>
@@ -13262,9 +12979,6 @@
         <w:fldChar w:fldCharType="separate"/>
       </w:r>
       <w:r>
-        <w:rPr>
-          <w:noProof/>
-        </w:rPr>
         <w:t>8</w:t>
       </w:r>
       <w:r>
@@ -13411,15 +13125,9 @@
         <w:fldChar w:fldCharType="separate"/>
       </w:r>
       <w:r>
-        <w:rPr>
-          <w:noProof/>
-        </w:rPr>
         <w:t>5</w:t>
       </w:r>
       <w:r>
-        <w:rPr>
-          <w:noProof/>
-        </w:rPr>
         <w:fldChar w:fldCharType="end"/>
       </w:r>
       <w:r>
@@ -15227,9 +14935,6 @@
         <w:jc w:val="center"/>
       </w:pPr>
       <w:r>
-        <w:rPr>
-          <w:noProof/>
-        </w:rPr>
         <mc:AlternateContent>
           <mc:Choice Requires="wpi">
             <w:drawing>
@@ -15291,9 +14996,6 @@
         </mc:AlternateContent>
       </w:r>
       <w:r>
-        <w:rPr>
-          <w:noProof/>
-        </w:rPr>
         <mc:AlternateContent>
           <mc:Choice Requires="wpi">
             <w:drawing>
@@ -15336,9 +15038,6 @@
         </mc:AlternateContent>
       </w:r>
       <w:r>
-        <w:rPr>
-          <w:noProof/>
-        </w:rPr>
         <mc:AlternateContent>
           <mc:Choice Requires="wpi">
             <w:drawing>
@@ -15381,9 +15080,6 @@
         </mc:AlternateContent>
       </w:r>
       <w:r>
-        <w:rPr>
-          <w:noProof/>
-        </w:rPr>
         <mc:AlternateContent>
           <mc:Choice Requires="wpi">
             <w:drawing>
@@ -15426,9 +15122,6 @@
         </mc:AlternateContent>
       </w:r>
       <w:r>
-        <w:rPr>
-          <w:noProof/>
-        </w:rPr>
         <w:drawing>
           <wp:inline distT="0" distB="0" distL="0" distR="0" wp14:anchorId="18CA3C01" wp14:editId="76CB729B">
             <wp:extent cx="5692866" cy="3324570"/>
@@ -15494,9 +15187,6 @@
         <w:fldChar w:fldCharType="separate"/>
       </w:r>
       <w:r>
-        <w:rPr>
-          <w:noProof/>
-        </w:rPr>
         <w:t>9</w:t>
       </w:r>
       <w:r>
@@ -15748,9 +15438,6 @@
         <w:jc w:val="center"/>
       </w:pPr>
       <w:r>
-        <w:rPr>
-          <w:noProof/>
-        </w:rPr>
         <mc:AlternateContent>
           <mc:Choice Requires="wpi">
             <w:drawing>
@@ -15793,9 +15480,6 @@
         </mc:AlternateContent>
       </w:r>
       <w:r>
-        <w:rPr>
-          <w:noProof/>
-        </w:rPr>
         <mc:AlternateContent>
           <mc:Choice Requires="wpi">
             <w:drawing>
@@ -15838,9 +15522,6 @@
         </mc:AlternateContent>
       </w:r>
       <w:r>
-        <w:rPr>
-          <w:noProof/>
-        </w:rPr>
         <mc:AlternateContent>
           <mc:Choice Requires="wpi">
             <w:drawing>
@@ -15883,9 +15564,6 @@
         </mc:AlternateContent>
       </w:r>
       <w:r>
-        <w:rPr>
-          <w:noProof/>
-        </w:rPr>
         <mc:AlternateContent>
           <mc:Choice Requires="wpi">
             <w:drawing>
@@ -15928,9 +15606,6 @@
         </mc:AlternateContent>
       </w:r>
       <w:r>
-        <w:rPr>
-          <w:noProof/>
-        </w:rPr>
         <mc:AlternateContent>
           <mc:Choice Requires="wpi">
             <w:drawing>
@@ -15973,9 +15648,6 @@
         </mc:AlternateContent>
       </w:r>
       <w:r>
-        <w:rPr>
-          <w:noProof/>
-        </w:rPr>
         <w:drawing>
           <wp:inline distT="0" distB="0" distL="0" distR="0" wp14:anchorId="33216AC0" wp14:editId="682E2971">
             <wp:extent cx="5759450" cy="3418205"/>
@@ -16037,9 +15709,6 @@
         <w:fldChar w:fldCharType="separate"/>
       </w:r>
       <w:r>
-        <w:rPr>
-          <w:noProof/>
-        </w:rPr>
         <w:t>10</w:t>
       </w:r>
       <w:r>
@@ -16269,13 +15938,7 @@
         <w:t xml:space="preserve"> </w:t>
       </w:r>
       <w:r>
-        <w:t xml:space="preserve">данных репозиториев платформы </w:t>
-      </w:r>
-      <w:r>
-        <w:rPr>
-          <w:lang w:val="en-US"/>
-        </w:rPr>
-        <w:t>GitHub</w:t>
+        <w:t>данных репозиториев платформы GitHub</w:t>
       </w:r>
       <w:r>
         <w:t>.</w:t>
@@ -16284,18 +15947,9 @@
     <w:p>
       <w:pPr>
         <w:pStyle w:val="a5"/>
-        <w:rPr>
-          <w:lang w:val="en-US"/>
-        </w:rPr>
-      </w:pPr>
-      <w:r>
-        <w:t>Были выполнены следующие задачи</w:t>
-      </w:r>
-      <w:r>
-        <w:rPr>
-          <w:lang w:val="en-US"/>
-        </w:rPr>
-        <w:t>.</w:t>
+      </w:pPr>
+      <w:r>
+        <w:t>Были выполнены следующие задачи.</w:t>
       </w:r>
     </w:p>
     <w:p>
@@ -16317,10 +15971,7 @@
         <w:t>я</w:t>
       </w:r>
       <w:r>
-        <w:t xml:space="preserve"> предметной области</w:t>
-      </w:r>
-      <w:r>
-        <w:t>.</w:t>
+        <w:t xml:space="preserve"> предметной области.</w:t>
       </w:r>
     </w:p>
     <w:p>
@@ -16328,19 +15979,13 @@
         <w:pStyle w:val="a3"/>
       </w:pPr>
       <w:r>
-        <w:t>В</w:t>
-      </w:r>
-      <w:r>
-        <w:t>ыполн</w:t>
+        <w:t>Выполн</w:t>
       </w:r>
       <w:r>
         <w:t xml:space="preserve">ено </w:t>
       </w:r>
       <w:r>
-        <w:t>проектирование пользовательского интерфейса и архитектуры системы</w:t>
-      </w:r>
-      <w:r>
-        <w:t>.</w:t>
+        <w:t>проектирование пользовательского интерфейса и архитектуры системы.</w:t>
       </w:r>
     </w:p>
     <w:p>
@@ -16357,10 +16002,7 @@
         <w:t>ы</w:t>
       </w:r>
       <w:r>
-        <w:t xml:space="preserve"> поиска шаблонов</w:t>
-      </w:r>
-      <w:r>
-        <w:t>.</w:t>
+        <w:t xml:space="preserve"> поиска шаблонов.</w:t>
       </w:r>
     </w:p>
     <w:p>
@@ -16377,10 +16019,7 @@
         <w:t>дено</w:t>
       </w:r>
       <w:r>
-        <w:t xml:space="preserve"> тестирование системы поиска шаблонов</w:t>
-      </w:r>
-      <w:r>
-        <w:t>.</w:t>
+        <w:t xml:space="preserve"> тестирование системы поиска шаблонов.</w:t>
       </w:r>
     </w:p>
     <w:p>
@@ -16423,13 +16062,7 @@
         <w:t xml:space="preserve"> платформы</w:t>
       </w:r>
       <w:r>
-        <w:t xml:space="preserve"> </w:t>
-      </w:r>
-      <w:r>
-        <w:rPr>
-          <w:lang w:val="en-US"/>
-        </w:rPr>
-        <w:t>GitHub</w:t>
+        <w:t xml:space="preserve"> GitHub</w:t>
       </w:r>
       <w:r>
         <w:t>.</w:t>

</xml_diff>